<commit_message>
feat(activities): deploy Activities Extraction v2 schema and validator tool
- Implement Activities Extraction v2 schema tracking AI source, internal vs external provider roles, and own brands.
- Provide company-specific context prompts to ground entity mentions.
- Prototype human audit validation tool for paragraph-level activity annotations.
</commit_message>
<xml_diff>
--- a/thesis_document/template/reference.docx
+++ b/thesis_document/template/reference.docx
@@ -4869,6 +4869,20 @@
       <w:szCs w:val="16"/>
     </w:rPr>
   </w:style>
+  <w:style w:styleId="Table" w:type="table">
+    <w:name w:val="Table"/>
+    <w:basedOn w:val="Tablaconcuadrcula"/>
+    <w:tblPr>
+      <w:tblBorders>
+        <w:top w:color="00897B" w:space="0" w:sz="4" w:val="single"/>
+        <w:left w:color="00897B" w:space="0" w:sz="4" w:val="single"/>
+        <w:bottom w:color="00897B" w:space="0" w:sz="4" w:val="single"/>
+        <w:right w:color="00897B" w:space="0" w:sz="4" w:val="single"/>
+        <w:insideH w:color="00897B" w:space="0" w:sz="4" w:val="single"/>
+        <w:insideV w:color="00897B" w:space="0" w:sz="4" w:val="single"/>
+      </w:tblBorders>
+    </w:tblPr>
+  </w:style>
 </w:styles>
 </file>
 

</xml_diff>

<commit_message>
Add a styled Heading 4 to the Word template
The reference.docx template had no Heading 4 style defined at all, so
#### subsections (e.g. 3.3.5.1) rendered in Word's plain default. Adds
a Heading 4 style matching the same green (008B7B) as Headings 1-3, in
bold italic at 11pt, without the all-caps treatment used one level up,
so a sub-subsection reads as a quieter variant of the section styling
above it rather than another shouting heading.

Co-Authored-By: Claude Sonnet 5 <noreply@anthropic.com>
Claude-Session: https://claude.ai/code/session_01Sb8TCK2xpj5DLMacwHuAEw
</commit_message>
<xml_diff>
--- a/thesis_document/template/reference.docx
+++ b/thesis_document/template/reference.docx
@@ -4576,6 +4576,28 @@
       <w:caps/>
       <w:color w:val="008B7B"/>
       <w:sz w:val="24"/>
+    </w:rPr>
+  </w:style>
+  <w:style w:type="paragraph" w:styleId="Ttulo4">
+    <w:name w:val="heading 4"/>
+    <w:basedOn w:val="Normal"/>
+    <w:next w:val="Normal"/>
+    <w:qFormat/>
+    <w:rsid w:val="00A97C8E"/>
+    <w:pPr>
+      <w:keepNext/>
+      <w:spacing w:after="0"/>
+      <w:jc w:val="left"/>
+      <w:outlineLvl w:val="3"/>
+    </w:pPr>
+    <w:rPr>
+      <w:rFonts w:cs="Arial"/>
+      <w:b/>
+      <w:bCs/>
+      <w:i/>
+      <w:iCs/>
+      <w:color w:val="008B7B"/>
+      <w:sz w:val="22"/>
     </w:rPr>
   </w:style>
   <w:style w:type="character" w:default="1" w:styleId="Fuentedeprrafopredeter">

</xml_diff>

<commit_message>
Force hyperlinks to bold black, no underline (pandoc ignores reference-doc for this style)
Editing template/reference.docx's Hyperlink character style alone did
nothing: pandoc's docx writer always emits its own hardcoded Hyperlink
style (blue, single underline) into the rendered document regardless
of what the reference doc defines for that style name, and the cover
merge step then keeps the cover document's own version on top of that.
Renamed the template's existing Spanish-named hyperlink style
("Hipervnculo") to the literal "Hyperlink" ID pandoc expects, for
clarity, but the actual fix is a new post-processing step in
render.py's docx pipeline (fix_hyperlink_style), applied to the final
merged document right before save so neither pandoc's nor the cover's
default can win.

Co-Authored-By: Claude Sonnet 5 <noreply@anthropic.com>
Claude-Session: https://claude.ai/code/session_01Sb8TCK2xpj5DLMacwHuAEw
</commit_message>
<xml_diff>
--- a/thesis_document/template/reference.docx
+++ b/thesis_document/template/reference.docx
@@ -4821,12 +4821,14 @@
       <w:ind w:left="480"/>
     </w:pPr>
   </w:style>
-  <w:style w:type="character" w:styleId="Hipervnculo">
+  <w:style w:type="character" w:styleId="Hyperlink">
     <w:name w:val="Hyperlink"/>
     <w:rsid w:val="00B3713E"/>
     <w:rPr>
-      <w:color w:val="0000FF"/>
-      <w:u w:val="single"/>
+      <w:b/>
+      <w:bCs/>
+      <w:color w:val="000000"/>
+      <w:u w:val="none"/>
     </w:rPr>
   </w:style>
   <w:style w:type="paragraph" w:styleId="Mapadeldocumento">

</xml_diff>

<commit_message>
docs(thesis): narrative polish, bibliography alignment, table restorations, and render optimizations
- Narrative polish across all thesis chapters: split dense paragraphs, trim redundant text, and improve clarity.
- Resolve bibliography citation mismatches, sourcing and citing 18 unreferenced bibliography entries.
- Restore empirical tables and enrich Chapter 4 activity analysis with named-company quotes.
- Optimize DuckDB query caching and Quarto document rendering pipeline.
</commit_message>
<xml_diff>
--- a/thesis_document/template/reference.docx
+++ b/thesis_document/template/reference.docx
@@ -4578,6 +4578,28 @@
       <w:sz w:val="24"/>
     </w:rPr>
   </w:style>
+  <w:style w:type="paragraph" w:styleId="Ttulo4">
+    <w:name w:val="heading 4"/>
+    <w:basedOn w:val="Normal"/>
+    <w:next w:val="Normal"/>
+    <w:qFormat/>
+    <w:rsid w:val="00A97C8E"/>
+    <w:pPr>
+      <w:keepNext/>
+      <w:spacing w:after="0"/>
+      <w:jc w:val="left"/>
+      <w:outlineLvl w:val="3"/>
+    </w:pPr>
+    <w:rPr>
+      <w:rFonts w:cs="Arial"/>
+      <w:b/>
+      <w:bCs/>
+      <w:i/>
+      <w:iCs/>
+      <w:color w:val="008B7B"/>
+      <w:sz w:val="22"/>
+    </w:rPr>
+  </w:style>
   <w:style w:type="character" w:default="1" w:styleId="Fuentedeprrafopredeter">
     <w:name w:val="Default Paragraph Font"/>
     <w:uiPriority w:val="1"/>
@@ -4799,12 +4821,14 @@
       <w:ind w:left="480"/>
     </w:pPr>
   </w:style>
-  <w:style w:type="character" w:styleId="Hipervnculo">
+  <w:style w:type="character" w:styleId="Hyperlink">
     <w:name w:val="Hyperlink"/>
     <w:rsid w:val="00B3713E"/>
     <w:rPr>
-      <w:color w:val="0000FF"/>
-      <w:u w:val="single"/>
+      <w:b/>
+      <w:bCs/>
+      <w:color w:val="000000"/>
+      <w:u w:val="none"/>
     </w:rPr>
   </w:style>
   <w:style w:type="paragraph" w:styleId="Mapadeldocumento">
@@ -4882,6 +4906,49 @@
         <w:insideV w:color="00897B" w:space="0" w:sz="4" w:val="single"/>
       </w:tblBorders>
     </w:tblPr>
+  </w:style>
+  <w:style w:type="paragraph" w:styleId="ImageCaption">
+    <w:name w:val="Image Caption"/>
+    <w:basedOn w:val="Normal"/>
+    <w:next w:val="Normal"/>
+    <w:qFormat/>
+    <w:pPr>
+      <w:spacing w:before="200" w:after="60"/>
+      <w:jc w:val="left"/>
+    </w:pPr>
+    <w:rPr>
+      <w:rFonts w:ascii="Calibri" w:hAnsi="Calibri"/>
+      <w:b/>
+      <w:bCs/>
+      <w:color w:val="404040"/>
+      <w:sz w:val="19"/>
+      <w:szCs w:val="19"/>
+    </w:rPr>
+  </w:style>
+  <w:style w:type="character" w:styleId="CaptionText">
+    <w:name w:val="Caption Text"/>
+    <w:basedOn w:val="Fuentedeprrafopredeter"/>
+    <w:qFormat/>
+    <w:rPr>
+      <w:b w:val="0"/>
+      <w:bCs w:val="0"/>
+    </w:rPr>
+  </w:style>
+  <w:style w:type="paragraph" w:styleId="FigureNote">
+    <w:name w:val="Figure Note"/>
+    <w:basedOn w:val="Normal"/>
+    <w:next w:val="Normal"/>
+    <w:qFormat/>
+    <w:pPr>
+      <w:spacing w:before="40" w:after="120"/>
+      <w:jc w:val="left"/>
+    </w:pPr>
+    <w:rPr>
+      <w:rFonts w:ascii="Calibri" w:hAnsi="Calibri"/>
+      <w:color w:val="595959"/>
+      <w:sz w:val="18"/>
+      <w:szCs w:val="18"/>
+    </w:rPr>
   </w:style>
 </w:styles>
 </file>

</xml_diff>

<commit_message>
headings: small caps with a full-size initial on each word
The heading 1-3 styles used w:caps, which draws every letter as a full
capital. w:smallCaps instead reduces lowercase letters to small capitals
and leaves real capitals at full height, so the render title-cases those
headings to give each word its full-size initial.

Co-Authored-By: Claude Opus 5 (1M context) <noreply@anthropic.com>
Claude-Session: https://claude.ai/code/session_01EKGgpxbKgCJmfLnZnty4ou
</commit_message>
<xml_diff>
--- a/thesis_document/template/reference.docx
+++ b/thesis_document/template/reference.docx
@@ -4526,7 +4526,7 @@
       <w:rFonts w:cs="Arial"/>
       <w:b/>
       <w:bCs/>
-      <w:caps/>
+      <w:smallCaps/>
       <w:color w:val="008B7B"/>
       <w:kern w:val="32"/>
       <w:sz w:val="40"/>
@@ -4551,7 +4551,7 @@
       <w:b/>
       <w:bCs/>
       <w:iCs/>
-      <w:caps/>
+      <w:smallCaps/>
       <w:color w:val="008B7B"/>
       <w:sz w:val="32"/>
       <w:szCs w:val="28"/>
@@ -4573,7 +4573,7 @@
       <w:rFonts w:cs="Arial"/>
       <w:b/>
       <w:bCs/>
-      <w:caps/>
+      <w:smallCaps/>
       <w:color w:val="008B7B"/>
       <w:sz w:val="24"/>
     </w:rPr>

</xml_diff>

<commit_message>
headings: small caps on heading 1 only
Heading 2 and 3 keep their full capitals.

Co-Authored-By: Claude Opus 5 (1M context) <noreply@anthropic.com>
Claude-Session: https://claude.ai/code/session_01EKGgpxbKgCJmfLnZnty4ou
</commit_message>
<xml_diff>
--- a/thesis_document/template/reference.docx
+++ b/thesis_document/template/reference.docx
@@ -4551,7 +4551,7 @@
       <w:b/>
       <w:bCs/>
       <w:iCs/>
-      <w:smallCaps/>
+      <w:caps/>
       <w:color w:val="008B7B"/>
       <w:sz w:val="32"/>
       <w:szCs w:val="28"/>
@@ -4573,7 +4573,7 @@
       <w:rFonts w:cs="Arial"/>
       <w:b/>
       <w:bCs/>
-      <w:smallCaps/>
+      <w:caps/>
       <w:color w:val="008B7B"/>
       <w:sz w:val="24"/>
     </w:rPr>

</xml_diff>